<commit_message>
docs(requisitos): agrega RQF-13..16 y RQNF-09 al documento del proyecto
Requisitos que ya existen en el codigo y no estaban documentados:
contrato por WhatsApp, avisos automaticos de vencimiento, prueba
gratuita de 14 dias, app movil del miembro e integracion continua.
Solo se agregan filas a las tablas 5 y 6 con el mismo formato; el
resto del docx queda intacto byte a byte (solo cambia document.xml).
</commit_message>
<xml_diff>
--- a/Documentación/Proyecto FitLoyalty.docx
+++ b/Documentación/Proyecto FitLoyalty.docx
@@ -4649,6 +4649,484 @@
           </w:p>
         </w:tc>
       </w:tr>
+      <w:tr>
+        <w:trPr>
+          <w:cantSplit w:val="0"/>
+          <w:trHeight w:val="975" w:hRule="atLeast"/>
+          <w:tblHeader w:val="0"/>
+        </w:trPr>
+        <w:tc>
+          <w:tcPr>
+            <w:tcBorders>
+              <w:top w:color="000000" w:space="0" w:sz="0" w:val="nil"/>
+              <w:left w:color="aaaaaa" w:space="0" w:sz="5" w:val="single"/>
+              <w:bottom w:color="aaaaaa" w:space="0" w:sz="5" w:val="single"/>
+              <w:right w:color="aaaaaa" w:space="0" w:sz="5" w:val="single"/>
+            </w:tcBorders>
+            <w:tcMar>
+              <w:top w:w="80.0" w:type="dxa"/>
+              <w:left w:w="100.0" w:type="dxa"/>
+              <w:bottom w:w="80.0" w:type="dxa"/>
+              <w:right w:w="100.0" w:type="dxa"/>
+            </w:tcMar>
+            <w:vAlign w:val="top"/>
+          </w:tcPr>
+          <w:p>
+            <w:pPr>
+              <w:spacing w:line="319.2000000000001" w:lineRule="auto"/>
+              <w:jc w:val="both"/>
+              <w:rPr>
+                <w:rFonts w:ascii="Times New Roman" w:cs="Times New Roman" w:eastAsia="Times New Roman" w:hAnsi="Times New Roman"/>
+                <w:sz w:val="24"/>
+                <w:szCs w:val="24"/>
+              </w:rPr>
+            </w:pPr>
+            <w:r>
+              <w:rPr>
+                <w:rFonts w:ascii="Times New Roman" w:cs="Times New Roman" w:eastAsia="Times New Roman" w:hAnsi="Times New Roman"/>
+                <w:sz w:val="24"/>
+                <w:szCs w:val="24"/>
+                <w:rtl w:val="0"/>
+              </w:rPr>
+              <w:t xml:space="preserve">RQF-13</w:t>
+            </w:r>
+          </w:p>
+        </w:tc>
+        <w:tc>
+          <w:tcPr>
+            <w:tcBorders>
+              <w:top w:color="000000" w:space="0" w:sz="0" w:val="nil"/>
+              <w:left w:color="000000" w:space="0" w:sz="0" w:val="nil"/>
+              <w:bottom w:color="aaaaaa" w:space="0" w:sz="5" w:val="single"/>
+              <w:right w:color="aaaaaa" w:space="0" w:sz="5" w:val="single"/>
+            </w:tcBorders>
+            <w:tcMar>
+              <w:top w:w="80.0" w:type="dxa"/>
+              <w:left w:w="100.0" w:type="dxa"/>
+              <w:bottom w:w="80.0" w:type="dxa"/>
+              <w:right w:w="100.0" w:type="dxa"/>
+            </w:tcMar>
+            <w:vAlign w:val="top"/>
+          </w:tcPr>
+          <w:p>
+            <w:pPr>
+              <w:spacing w:line="319.2000000000001" w:lineRule="auto"/>
+              <w:jc w:val="both"/>
+              <w:rPr>
+                <w:rFonts w:ascii="Times New Roman" w:cs="Times New Roman" w:eastAsia="Times New Roman" w:hAnsi="Times New Roman"/>
+                <w:sz w:val="24"/>
+                <w:szCs w:val="24"/>
+              </w:rPr>
+            </w:pPr>
+            <w:r>
+              <w:rPr>
+                <w:rFonts w:ascii="Times New Roman" w:cs="Times New Roman" w:eastAsia="Times New Roman" w:hAnsi="Times New Roman"/>
+                <w:sz w:val="24"/>
+                <w:szCs w:val="24"/>
+                <w:rtl w:val="0"/>
+              </w:rPr>
+              <w:t xml:space="preserve">Gestión de Miembros</w:t>
+            </w:r>
+          </w:p>
+        </w:tc>
+        <w:tc>
+          <w:tcPr>
+            <w:tcBorders>
+              <w:top w:color="000000" w:space="0" w:sz="0" w:val="nil"/>
+              <w:left w:color="000000" w:space="0" w:sz="0" w:val="nil"/>
+              <w:bottom w:color="aaaaaa" w:space="0" w:sz="5" w:val="single"/>
+              <w:right w:color="aaaaaa" w:space="0" w:sz="5" w:val="single"/>
+            </w:tcBorders>
+            <w:tcMar>
+              <w:top w:w="80.0" w:type="dxa"/>
+              <w:left w:w="100.0" w:type="dxa"/>
+              <w:bottom w:w="80.0" w:type="dxa"/>
+              <w:right w:w="100.0" w:type="dxa"/>
+            </w:tcMar>
+            <w:vAlign w:val="top"/>
+          </w:tcPr>
+          <w:p>
+            <w:pPr>
+              <w:spacing w:line="319.2000000000001" w:lineRule="auto"/>
+              <w:jc w:val="both"/>
+              <w:rPr>
+                <w:rFonts w:ascii="Times New Roman" w:cs="Times New Roman" w:eastAsia="Times New Roman" w:hAnsi="Times New Roman"/>
+                <w:sz w:val="24"/>
+                <w:szCs w:val="24"/>
+              </w:rPr>
+            </w:pPr>
+            <w:r>
+              <w:rPr>
+                <w:rFonts w:ascii="Times New Roman" w:cs="Times New Roman" w:eastAsia="Times New Roman" w:hAnsi="Times New Roman"/>
+                <w:sz w:val="24"/>
+                <w:szCs w:val="24"/>
+                <w:rtl w:val="0"/>
+              </w:rPr>
+              <w:t xml:space="preserve">El sistema debe permitir al administrador enviar por WhatsApp el contrato de membresía de un miembro, registrando cada envío (fecha, teléfono de destino y resultado) como constancia.</w:t>
+            </w:r>
+          </w:p>
+        </w:tc>
+      </w:tr>
+      <w:tr>
+        <w:trPr>
+          <w:cantSplit w:val="0"/>
+          <w:trHeight w:val="975" w:hRule="atLeast"/>
+          <w:tblHeader w:val="0"/>
+        </w:trPr>
+        <w:tc>
+          <w:tcPr>
+            <w:tcBorders>
+              <w:top w:color="000000" w:space="0" w:sz="0" w:val="nil"/>
+              <w:left w:color="aaaaaa" w:space="0" w:sz="5" w:val="single"/>
+              <w:bottom w:color="aaaaaa" w:space="0" w:sz="5" w:val="single"/>
+              <w:right w:color="aaaaaa" w:space="0" w:sz="5" w:val="single"/>
+            </w:tcBorders>
+            <w:shd w:fill="eaf5e0" w:val="clear"/>
+            <w:tcMar>
+              <w:top w:w="80.0" w:type="dxa"/>
+              <w:left w:w="100.0" w:type="dxa"/>
+              <w:bottom w:w="80.0" w:type="dxa"/>
+              <w:right w:w="100.0" w:type="dxa"/>
+            </w:tcMar>
+            <w:vAlign w:val="top"/>
+          </w:tcPr>
+          <w:p>
+            <w:pPr>
+              <w:spacing w:line="319.2000000000001" w:lineRule="auto"/>
+              <w:jc w:val="both"/>
+              <w:rPr>
+                <w:rFonts w:ascii="Times New Roman" w:cs="Times New Roman" w:eastAsia="Times New Roman" w:hAnsi="Times New Roman"/>
+                <w:sz w:val="24"/>
+                <w:szCs w:val="24"/>
+              </w:rPr>
+            </w:pPr>
+            <w:r>
+              <w:rPr>
+                <w:rFonts w:ascii="Times New Roman" w:cs="Times New Roman" w:eastAsia="Times New Roman" w:hAnsi="Times New Roman"/>
+                <w:sz w:val="24"/>
+                <w:szCs w:val="24"/>
+                <w:rtl w:val="0"/>
+              </w:rPr>
+              <w:t xml:space="preserve">RQF-14</w:t>
+            </w:r>
+          </w:p>
+        </w:tc>
+        <w:tc>
+          <w:tcPr>
+            <w:tcBorders>
+              <w:top w:color="000000" w:space="0" w:sz="0" w:val="nil"/>
+              <w:left w:color="000000" w:space="0" w:sz="0" w:val="nil"/>
+              <w:bottom w:color="aaaaaa" w:space="0" w:sz="5" w:val="single"/>
+              <w:right w:color="aaaaaa" w:space="0" w:sz="5" w:val="single"/>
+            </w:tcBorders>
+            <w:shd w:fill="eaf5e0" w:val="clear"/>
+            <w:tcMar>
+              <w:top w:w="80.0" w:type="dxa"/>
+              <w:left w:w="100.0" w:type="dxa"/>
+              <w:bottom w:w="80.0" w:type="dxa"/>
+              <w:right w:w="100.0" w:type="dxa"/>
+            </w:tcMar>
+            <w:vAlign w:val="top"/>
+          </w:tcPr>
+          <w:p>
+            <w:pPr>
+              <w:spacing w:line="319.2000000000001" w:lineRule="auto"/>
+              <w:jc w:val="both"/>
+              <w:rPr>
+                <w:rFonts w:ascii="Times New Roman" w:cs="Times New Roman" w:eastAsia="Times New Roman" w:hAnsi="Times New Roman"/>
+                <w:sz w:val="24"/>
+                <w:szCs w:val="24"/>
+              </w:rPr>
+            </w:pPr>
+            <w:r>
+              <w:rPr>
+                <w:rFonts w:ascii="Times New Roman" w:cs="Times New Roman" w:eastAsia="Times New Roman" w:hAnsi="Times New Roman"/>
+                <w:sz w:val="24"/>
+                <w:szCs w:val="24"/>
+                <w:rtl w:val="0"/>
+              </w:rPr>
+              <w:t xml:space="preserve">Gestión de Miembros</w:t>
+            </w:r>
+          </w:p>
+        </w:tc>
+        <w:tc>
+          <w:tcPr>
+            <w:tcBorders>
+              <w:top w:color="000000" w:space="0" w:sz="0" w:val="nil"/>
+              <w:left w:color="000000" w:space="0" w:sz="0" w:val="nil"/>
+              <w:bottom w:color="aaaaaa" w:space="0" w:sz="5" w:val="single"/>
+              <w:right w:color="aaaaaa" w:space="0" w:sz="5" w:val="single"/>
+            </w:tcBorders>
+            <w:shd w:fill="eaf5e0" w:val="clear"/>
+            <w:tcMar>
+              <w:top w:w="80.0" w:type="dxa"/>
+              <w:left w:w="100.0" w:type="dxa"/>
+              <w:bottom w:w="80.0" w:type="dxa"/>
+              <w:right w:w="100.0" w:type="dxa"/>
+            </w:tcMar>
+            <w:vAlign w:val="top"/>
+          </w:tcPr>
+          <w:p>
+            <w:pPr>
+              <w:spacing w:line="319.2000000000001" w:lineRule="auto"/>
+              <w:jc w:val="both"/>
+              <w:rPr>
+                <w:rFonts w:ascii="Times New Roman" w:cs="Times New Roman" w:eastAsia="Times New Roman" w:hAnsi="Times New Roman"/>
+                <w:sz w:val="24"/>
+                <w:szCs w:val="24"/>
+              </w:rPr>
+            </w:pPr>
+            <w:r>
+              <w:rPr>
+                <w:rFonts w:ascii="Times New Roman" w:cs="Times New Roman" w:eastAsia="Times New Roman" w:hAnsi="Times New Roman"/>
+                <w:sz w:val="24"/>
+                <w:szCs w:val="24"/>
+                <w:rtl w:val="0"/>
+              </w:rPr>
+              <w:t xml:space="preserve">El sistema debe enviar automáticamente cada día por WhatsApp un aviso a los miembros cuya membresía vence dentro de los días de anticipación definidos por el gimnasio (3 por defecto) o el mismo día, sin repetir avisos, y permitir al administrador ejecutar el envío de forma manual.</w:t>
+            </w:r>
+          </w:p>
+        </w:tc>
+      </w:tr>
+      <w:tr>
+        <w:trPr>
+          <w:cantSplit w:val="0"/>
+          <w:trHeight w:val="975" w:hRule="atLeast"/>
+          <w:tblHeader w:val="0"/>
+        </w:trPr>
+        <w:tc>
+          <w:tcPr>
+            <w:tcBorders>
+              <w:top w:color="000000" w:space="0" w:sz="0" w:val="nil"/>
+              <w:left w:color="aaaaaa" w:space="0" w:sz="5" w:val="single"/>
+              <w:bottom w:color="aaaaaa" w:space="0" w:sz="5" w:val="single"/>
+              <w:right w:color="aaaaaa" w:space="0" w:sz="5" w:val="single"/>
+            </w:tcBorders>
+            <w:tcMar>
+              <w:top w:w="80.0" w:type="dxa"/>
+              <w:left w:w="100.0" w:type="dxa"/>
+              <w:bottom w:w="80.0" w:type="dxa"/>
+              <w:right w:w="100.0" w:type="dxa"/>
+            </w:tcMar>
+            <w:vAlign w:val="top"/>
+          </w:tcPr>
+          <w:p>
+            <w:pPr>
+              <w:spacing w:line="319.2000000000001" w:lineRule="auto"/>
+              <w:jc w:val="both"/>
+              <w:rPr>
+                <w:rFonts w:ascii="Times New Roman" w:cs="Times New Roman" w:eastAsia="Times New Roman" w:hAnsi="Times New Roman"/>
+                <w:sz w:val="24"/>
+                <w:szCs w:val="24"/>
+              </w:rPr>
+            </w:pPr>
+            <w:r>
+              <w:rPr>
+                <w:rFonts w:ascii="Times New Roman" w:cs="Times New Roman" w:eastAsia="Times New Roman" w:hAnsi="Times New Roman"/>
+                <w:sz w:val="24"/>
+                <w:szCs w:val="24"/>
+                <w:rtl w:val="0"/>
+              </w:rPr>
+              <w:t xml:space="preserve">RQF-15</w:t>
+            </w:r>
+          </w:p>
+        </w:tc>
+        <w:tc>
+          <w:tcPr>
+            <w:tcBorders>
+              <w:top w:color="000000" w:space="0" w:sz="0" w:val="nil"/>
+              <w:left w:color="000000" w:space="0" w:sz="0" w:val="nil"/>
+              <w:bottom w:color="aaaaaa" w:space="0" w:sz="5" w:val="single"/>
+              <w:right w:color="aaaaaa" w:space="0" w:sz="5" w:val="single"/>
+            </w:tcBorders>
+            <w:tcMar>
+              <w:top w:w="80.0" w:type="dxa"/>
+              <w:left w:w="100.0" w:type="dxa"/>
+              <w:bottom w:w="80.0" w:type="dxa"/>
+              <w:right w:w="100.0" w:type="dxa"/>
+            </w:tcMar>
+            <w:vAlign w:val="top"/>
+          </w:tcPr>
+          <w:p>
+            <w:pPr>
+              <w:spacing w:line="319.2000000000001" w:lineRule="auto"/>
+              <w:jc w:val="both"/>
+              <w:rPr>
+                <w:rFonts w:ascii="Times New Roman" w:cs="Times New Roman" w:eastAsia="Times New Roman" w:hAnsi="Times New Roman"/>
+                <w:sz w:val="24"/>
+                <w:szCs w:val="24"/>
+              </w:rPr>
+            </w:pPr>
+            <w:r>
+              <w:rPr>
+                <w:rFonts w:ascii="Times New Roman" w:cs="Times New Roman" w:eastAsia="Times New Roman" w:hAnsi="Times New Roman"/>
+                <w:sz w:val="24"/>
+                <w:szCs w:val="24"/>
+                <w:rtl w:val="0"/>
+              </w:rPr>
+              <w:t xml:space="preserve">Suscripción SaaS</w:t>
+            </w:r>
+          </w:p>
+        </w:tc>
+        <w:tc>
+          <w:tcPr>
+            <w:tcBorders>
+              <w:top w:color="000000" w:space="0" w:sz="0" w:val="nil"/>
+              <w:left w:color="000000" w:space="0" w:sz="0" w:val="nil"/>
+              <w:bottom w:color="aaaaaa" w:space="0" w:sz="5" w:val="single"/>
+              <w:right w:color="aaaaaa" w:space="0" w:sz="5" w:val="single"/>
+            </w:tcBorders>
+            <w:tcMar>
+              <w:top w:w="80.0" w:type="dxa"/>
+              <w:left w:w="100.0" w:type="dxa"/>
+              <w:bottom w:w="80.0" w:type="dxa"/>
+              <w:right w:w="100.0" w:type="dxa"/>
+            </w:tcMar>
+            <w:vAlign w:val="top"/>
+          </w:tcPr>
+          <w:p>
+            <w:pPr>
+              <w:spacing w:line="319.2000000000001" w:lineRule="auto"/>
+              <w:jc w:val="both"/>
+              <w:rPr>
+                <w:rFonts w:ascii="Times New Roman" w:cs="Times New Roman" w:eastAsia="Times New Roman" w:hAnsi="Times New Roman"/>
+                <w:sz w:val="24"/>
+                <w:szCs w:val="24"/>
+              </w:rPr>
+            </w:pPr>
+            <w:r>
+              <w:rPr>
+                <w:rFonts w:ascii="Times New Roman" w:cs="Times New Roman" w:eastAsia="Times New Roman" w:hAnsi="Times New Roman"/>
+                <w:sz w:val="24"/>
+                <w:szCs w:val="24"/>
+                <w:rtl w:val="0"/>
+              </w:rPr>
+              <w:t xml:space="preserve">El sistema debe permitir al dueño de un gimnasio registrarlo en la plataforma creando su cuenta de administrador, con un período de prueba gratuita de 14 días; al vencer la prueba, debe bloquear las operaciones del gimnasio e informar que la prueba terminó.</w:t>
+            </w:r>
+          </w:p>
+        </w:tc>
+      </w:tr>
+      <w:tr>
+        <w:trPr>
+          <w:cantSplit w:val="0"/>
+          <w:trHeight w:val="975" w:hRule="atLeast"/>
+          <w:tblHeader w:val="0"/>
+        </w:trPr>
+        <w:tc>
+          <w:tcPr>
+            <w:tcBorders>
+              <w:top w:color="000000" w:space="0" w:sz="0" w:val="nil"/>
+              <w:left w:color="aaaaaa" w:space="0" w:sz="5" w:val="single"/>
+              <w:bottom w:color="aaaaaa" w:space="0" w:sz="5" w:val="single"/>
+              <w:right w:color="aaaaaa" w:space="0" w:sz="5" w:val="single"/>
+            </w:tcBorders>
+            <w:shd w:fill="eaf5e0" w:val="clear"/>
+            <w:tcMar>
+              <w:top w:w="80.0" w:type="dxa"/>
+              <w:left w:w="100.0" w:type="dxa"/>
+              <w:bottom w:w="80.0" w:type="dxa"/>
+              <w:right w:w="100.0" w:type="dxa"/>
+            </w:tcMar>
+            <w:vAlign w:val="top"/>
+          </w:tcPr>
+          <w:p>
+            <w:pPr>
+              <w:spacing w:line="319.2000000000001" w:lineRule="auto"/>
+              <w:jc w:val="both"/>
+              <w:rPr>
+                <w:rFonts w:ascii="Times New Roman" w:cs="Times New Roman" w:eastAsia="Times New Roman" w:hAnsi="Times New Roman"/>
+                <w:sz w:val="24"/>
+                <w:szCs w:val="24"/>
+              </w:rPr>
+            </w:pPr>
+            <w:r>
+              <w:rPr>
+                <w:rFonts w:ascii="Times New Roman" w:cs="Times New Roman" w:eastAsia="Times New Roman" w:hAnsi="Times New Roman"/>
+                <w:sz w:val="24"/>
+                <w:szCs w:val="24"/>
+                <w:rtl w:val="0"/>
+              </w:rPr>
+              <w:t xml:space="preserve">RQF-16</w:t>
+            </w:r>
+          </w:p>
+        </w:tc>
+        <w:tc>
+          <w:tcPr>
+            <w:tcBorders>
+              <w:top w:color="000000" w:space="0" w:sz="0" w:val="nil"/>
+              <w:left w:color="000000" w:space="0" w:sz="0" w:val="nil"/>
+              <w:bottom w:color="aaaaaa" w:space="0" w:sz="5" w:val="single"/>
+              <w:right w:color="aaaaaa" w:space="0" w:sz="5" w:val="single"/>
+            </w:tcBorders>
+            <w:shd w:fill="eaf5e0" w:val="clear"/>
+            <w:tcMar>
+              <w:top w:w="80.0" w:type="dxa"/>
+              <w:left w:w="100.0" w:type="dxa"/>
+              <w:bottom w:w="80.0" w:type="dxa"/>
+              <w:right w:w="100.0" w:type="dxa"/>
+            </w:tcMar>
+            <w:vAlign w:val="top"/>
+          </w:tcPr>
+          <w:p>
+            <w:pPr>
+              <w:spacing w:line="319.2000000000001" w:lineRule="auto"/>
+              <w:jc w:val="both"/>
+              <w:rPr>
+                <w:rFonts w:ascii="Times New Roman" w:cs="Times New Roman" w:eastAsia="Times New Roman" w:hAnsi="Times New Roman"/>
+                <w:sz w:val="24"/>
+                <w:szCs w:val="24"/>
+              </w:rPr>
+            </w:pPr>
+            <w:r>
+              <w:rPr>
+                <w:rFonts w:ascii="Times New Roman" w:cs="Times New Roman" w:eastAsia="Times New Roman" w:hAnsi="Times New Roman"/>
+                <w:sz w:val="24"/>
+                <w:szCs w:val="24"/>
+                <w:rtl w:val="0"/>
+              </w:rPr>
+              <w:t xml:space="preserve">App Móvil del Miembro</w:t>
+            </w:r>
+          </w:p>
+        </w:tc>
+        <w:tc>
+          <w:tcPr>
+            <w:tcBorders>
+              <w:top w:color="000000" w:space="0" w:sz="0" w:val="nil"/>
+              <w:left w:color="000000" w:space="0" w:sz="0" w:val="nil"/>
+              <w:bottom w:color="aaaaaa" w:space="0" w:sz="5" w:val="single"/>
+              <w:right w:color="aaaaaa" w:space="0" w:sz="5" w:val="single"/>
+            </w:tcBorders>
+            <w:shd w:fill="eaf5e0" w:val="clear"/>
+            <w:tcMar>
+              <w:top w:w="80.0" w:type="dxa"/>
+              <w:left w:w="100.0" w:type="dxa"/>
+              <w:bottom w:w="80.0" w:type="dxa"/>
+              <w:right w:w="100.0" w:type="dxa"/>
+            </w:tcMar>
+            <w:vAlign w:val="top"/>
+          </w:tcPr>
+          <w:p>
+            <w:pPr>
+              <w:spacing w:line="319.2000000000001" w:lineRule="auto"/>
+              <w:jc w:val="both"/>
+              <w:rPr>
+                <w:rFonts w:ascii="Times New Roman" w:cs="Times New Roman" w:eastAsia="Times New Roman" w:hAnsi="Times New Roman"/>
+                <w:sz w:val="24"/>
+                <w:szCs w:val="24"/>
+              </w:rPr>
+            </w:pPr>
+            <w:r>
+              <w:rPr>
+                <w:rFonts w:ascii="Times New Roman" w:cs="Times New Roman" w:eastAsia="Times New Roman" w:hAnsi="Times New Roman"/>
+                <w:sz w:val="24"/>
+                <w:szCs w:val="24"/>
+                <w:rtl w:val="0"/>
+              </w:rPr>
+              <w:t xml:space="preserve">El sistema debe ofrecer al miembro una aplicación móvil en la que inicie sesión con su número de teléfono y la contraseña asignada por el gimnasio, y consulte su código QR de acceso, su plan vigente y su historial de asistencia.</w:t>
+            </w:r>
+          </w:p>
+        </w:tc>
+      </w:tr>
     </w:tbl>
     <w:p>
       <w:pPr>
@@ -5821,6 +6299,124 @@
                 <w:rtl w:val="0"/>
               </w:rPr>
               <w:t xml:space="preserve">El sistema debe poder desplegarse en servicios de nube (AWS, Railway, Render o equivalentes) mediante contenedores Docker, sin dependencia de infraestructura física local.</w:t>
+            </w:r>
+          </w:p>
+        </w:tc>
+      </w:tr>
+      <w:tr>
+        <w:trPr>
+          <w:cantSplit w:val="0"/>
+          <w:trHeight w:val="975" w:hRule="atLeast"/>
+          <w:tblHeader w:val="0"/>
+        </w:trPr>
+        <w:tc>
+          <w:tcPr>
+            <w:tcBorders>
+              <w:top w:color="000000" w:space="0" w:sz="0" w:val="nil"/>
+              <w:left w:color="aaaaaa" w:space="0" w:sz="5" w:val="single"/>
+              <w:bottom w:color="aaaaaa" w:space="0" w:sz="5" w:val="single"/>
+              <w:right w:color="aaaaaa" w:space="0" w:sz="5" w:val="single"/>
+            </w:tcBorders>
+            <w:tcMar>
+              <w:top w:w="80.0" w:type="dxa"/>
+              <w:left w:w="100.0" w:type="dxa"/>
+              <w:bottom w:w="80.0" w:type="dxa"/>
+              <w:right w:w="100.0" w:type="dxa"/>
+            </w:tcMar>
+            <w:vAlign w:val="top"/>
+          </w:tcPr>
+          <w:p>
+            <w:pPr>
+              <w:spacing w:line="319.2000000000001" w:lineRule="auto"/>
+              <w:jc w:val="both"/>
+              <w:rPr>
+                <w:rFonts w:ascii="Times New Roman" w:cs="Times New Roman" w:eastAsia="Times New Roman" w:hAnsi="Times New Roman"/>
+                <w:sz w:val="24"/>
+                <w:szCs w:val="24"/>
+              </w:rPr>
+            </w:pPr>
+            <w:r>
+              <w:rPr>
+                <w:rFonts w:ascii="Times New Roman" w:cs="Times New Roman" w:eastAsia="Times New Roman" w:hAnsi="Times New Roman"/>
+                <w:sz w:val="24"/>
+                <w:szCs w:val="24"/>
+                <w:rtl w:val="0"/>
+              </w:rPr>
+              <w:t xml:space="preserve">RQNF-09</w:t>
+            </w:r>
+          </w:p>
+        </w:tc>
+        <w:tc>
+          <w:tcPr>
+            <w:tcBorders>
+              <w:top w:color="000000" w:space="0" w:sz="0" w:val="nil"/>
+              <w:left w:color="000000" w:space="0" w:sz="0" w:val="nil"/>
+              <w:bottom w:color="aaaaaa" w:space="0" w:sz="5" w:val="single"/>
+              <w:right w:color="aaaaaa" w:space="0" w:sz="5" w:val="single"/>
+            </w:tcBorders>
+            <w:tcMar>
+              <w:top w:w="80.0" w:type="dxa"/>
+              <w:left w:w="100.0" w:type="dxa"/>
+              <w:bottom w:w="80.0" w:type="dxa"/>
+              <w:right w:w="100.0" w:type="dxa"/>
+            </w:tcMar>
+            <w:vAlign w:val="top"/>
+          </w:tcPr>
+          <w:p>
+            <w:pPr>
+              <w:spacing w:line="319.2000000000001" w:lineRule="auto"/>
+              <w:jc w:val="both"/>
+              <w:rPr>
+                <w:rFonts w:ascii="Times New Roman" w:cs="Times New Roman" w:eastAsia="Times New Roman" w:hAnsi="Times New Roman"/>
+                <w:sz w:val="24"/>
+                <w:szCs w:val="24"/>
+              </w:rPr>
+            </w:pPr>
+            <w:r>
+              <w:rPr>
+                <w:rFonts w:ascii="Times New Roman" w:cs="Times New Roman" w:eastAsia="Times New Roman" w:hAnsi="Times New Roman"/>
+                <w:sz w:val="24"/>
+                <w:szCs w:val="24"/>
+                <w:rtl w:val="0"/>
+              </w:rPr>
+              <w:t xml:space="preserve">Mantenibilidad</w:t>
+            </w:r>
+          </w:p>
+        </w:tc>
+        <w:tc>
+          <w:tcPr>
+            <w:tcBorders>
+              <w:top w:color="000000" w:space="0" w:sz="0" w:val="nil"/>
+              <w:left w:color="000000" w:space="0" w:sz="0" w:val="nil"/>
+              <w:bottom w:color="aaaaaa" w:space="0" w:sz="5" w:val="single"/>
+              <w:right w:color="aaaaaa" w:space="0" w:sz="5" w:val="single"/>
+            </w:tcBorders>
+            <w:tcMar>
+              <w:top w:w="80.0" w:type="dxa"/>
+              <w:left w:w="100.0" w:type="dxa"/>
+              <w:bottom w:w="80.0" w:type="dxa"/>
+              <w:right w:w="100.0" w:type="dxa"/>
+            </w:tcMar>
+            <w:vAlign w:val="top"/>
+          </w:tcPr>
+          <w:p>
+            <w:pPr>
+              <w:spacing w:line="319.2000000000001" w:lineRule="auto"/>
+              <w:jc w:val="both"/>
+              <w:rPr>
+                <w:rFonts w:ascii="Times New Roman" w:cs="Times New Roman" w:eastAsia="Times New Roman" w:hAnsi="Times New Roman"/>
+                <w:sz w:val="24"/>
+                <w:szCs w:val="24"/>
+              </w:rPr>
+            </w:pPr>
+            <w:r>
+              <w:rPr>
+                <w:rFonts w:ascii="Times New Roman" w:cs="Times New Roman" w:eastAsia="Times New Roman" w:hAnsi="Times New Roman"/>
+                <w:sz w:val="24"/>
+                <w:szCs w:val="24"/>
+                <w:rtl w:val="0"/>
+              </w:rPr>
+              <w:t xml:space="preserve">El código fuente debe validarse automáticamente en integración continua (GitHub Actions) en cada pull request y en cada cambio de la rama principal, con instalación limpia de dependencias, comprobación de sintaxis del backend y compilación del frontend en Node 24.</w:t>
             </w:r>
           </w:p>
         </w:tc>

</xml_diff>

<commit_message>
docs(requisitos): restaura Documentacion/Proyecto FitLoyalty.docx al original
Por decision de Luis, el documento final de requisitos queda solo en
docs/ con la numeracion de Santiago (RQF-13..26, RQNF-09..15). Se
devuelve el docx de Documentacion/ a la version de 54b19fa para que no
haya dos documentos con codigos distintos (revierte el contenido de
35af2c4 sin reescribir historia).
</commit_message>
<xml_diff>
--- a/Documentación/Proyecto FitLoyalty.docx
+++ b/Documentación/Proyecto FitLoyalty.docx
@@ -4649,484 +4649,6 @@
           </w:p>
         </w:tc>
       </w:tr>
-      <w:tr>
-        <w:trPr>
-          <w:cantSplit w:val="0"/>
-          <w:trHeight w:val="975" w:hRule="atLeast"/>
-          <w:tblHeader w:val="0"/>
-        </w:trPr>
-        <w:tc>
-          <w:tcPr>
-            <w:tcBorders>
-              <w:top w:color="000000" w:space="0" w:sz="0" w:val="nil"/>
-              <w:left w:color="aaaaaa" w:space="0" w:sz="5" w:val="single"/>
-              <w:bottom w:color="aaaaaa" w:space="0" w:sz="5" w:val="single"/>
-              <w:right w:color="aaaaaa" w:space="0" w:sz="5" w:val="single"/>
-            </w:tcBorders>
-            <w:tcMar>
-              <w:top w:w="80.0" w:type="dxa"/>
-              <w:left w:w="100.0" w:type="dxa"/>
-              <w:bottom w:w="80.0" w:type="dxa"/>
-              <w:right w:w="100.0" w:type="dxa"/>
-            </w:tcMar>
-            <w:vAlign w:val="top"/>
-          </w:tcPr>
-          <w:p>
-            <w:pPr>
-              <w:spacing w:line="319.2000000000001" w:lineRule="auto"/>
-              <w:jc w:val="both"/>
-              <w:rPr>
-                <w:rFonts w:ascii="Times New Roman" w:cs="Times New Roman" w:eastAsia="Times New Roman" w:hAnsi="Times New Roman"/>
-                <w:sz w:val="24"/>
-                <w:szCs w:val="24"/>
-              </w:rPr>
-            </w:pPr>
-            <w:r>
-              <w:rPr>
-                <w:rFonts w:ascii="Times New Roman" w:cs="Times New Roman" w:eastAsia="Times New Roman" w:hAnsi="Times New Roman"/>
-                <w:sz w:val="24"/>
-                <w:szCs w:val="24"/>
-                <w:rtl w:val="0"/>
-              </w:rPr>
-              <w:t xml:space="preserve">RQF-13</w:t>
-            </w:r>
-          </w:p>
-        </w:tc>
-        <w:tc>
-          <w:tcPr>
-            <w:tcBorders>
-              <w:top w:color="000000" w:space="0" w:sz="0" w:val="nil"/>
-              <w:left w:color="000000" w:space="0" w:sz="0" w:val="nil"/>
-              <w:bottom w:color="aaaaaa" w:space="0" w:sz="5" w:val="single"/>
-              <w:right w:color="aaaaaa" w:space="0" w:sz="5" w:val="single"/>
-            </w:tcBorders>
-            <w:tcMar>
-              <w:top w:w="80.0" w:type="dxa"/>
-              <w:left w:w="100.0" w:type="dxa"/>
-              <w:bottom w:w="80.0" w:type="dxa"/>
-              <w:right w:w="100.0" w:type="dxa"/>
-            </w:tcMar>
-            <w:vAlign w:val="top"/>
-          </w:tcPr>
-          <w:p>
-            <w:pPr>
-              <w:spacing w:line="319.2000000000001" w:lineRule="auto"/>
-              <w:jc w:val="both"/>
-              <w:rPr>
-                <w:rFonts w:ascii="Times New Roman" w:cs="Times New Roman" w:eastAsia="Times New Roman" w:hAnsi="Times New Roman"/>
-                <w:sz w:val="24"/>
-                <w:szCs w:val="24"/>
-              </w:rPr>
-            </w:pPr>
-            <w:r>
-              <w:rPr>
-                <w:rFonts w:ascii="Times New Roman" w:cs="Times New Roman" w:eastAsia="Times New Roman" w:hAnsi="Times New Roman"/>
-                <w:sz w:val="24"/>
-                <w:szCs w:val="24"/>
-                <w:rtl w:val="0"/>
-              </w:rPr>
-              <w:t xml:space="preserve">Gestión de Miembros</w:t>
-            </w:r>
-          </w:p>
-        </w:tc>
-        <w:tc>
-          <w:tcPr>
-            <w:tcBorders>
-              <w:top w:color="000000" w:space="0" w:sz="0" w:val="nil"/>
-              <w:left w:color="000000" w:space="0" w:sz="0" w:val="nil"/>
-              <w:bottom w:color="aaaaaa" w:space="0" w:sz="5" w:val="single"/>
-              <w:right w:color="aaaaaa" w:space="0" w:sz="5" w:val="single"/>
-            </w:tcBorders>
-            <w:tcMar>
-              <w:top w:w="80.0" w:type="dxa"/>
-              <w:left w:w="100.0" w:type="dxa"/>
-              <w:bottom w:w="80.0" w:type="dxa"/>
-              <w:right w:w="100.0" w:type="dxa"/>
-            </w:tcMar>
-            <w:vAlign w:val="top"/>
-          </w:tcPr>
-          <w:p>
-            <w:pPr>
-              <w:spacing w:line="319.2000000000001" w:lineRule="auto"/>
-              <w:jc w:val="both"/>
-              <w:rPr>
-                <w:rFonts w:ascii="Times New Roman" w:cs="Times New Roman" w:eastAsia="Times New Roman" w:hAnsi="Times New Roman"/>
-                <w:sz w:val="24"/>
-                <w:szCs w:val="24"/>
-              </w:rPr>
-            </w:pPr>
-            <w:r>
-              <w:rPr>
-                <w:rFonts w:ascii="Times New Roman" w:cs="Times New Roman" w:eastAsia="Times New Roman" w:hAnsi="Times New Roman"/>
-                <w:sz w:val="24"/>
-                <w:szCs w:val="24"/>
-                <w:rtl w:val="0"/>
-              </w:rPr>
-              <w:t xml:space="preserve">El sistema debe permitir al administrador enviar por WhatsApp el contrato de membresía de un miembro, registrando cada envío (fecha, teléfono de destino y resultado) como constancia.</w:t>
-            </w:r>
-          </w:p>
-        </w:tc>
-      </w:tr>
-      <w:tr>
-        <w:trPr>
-          <w:cantSplit w:val="0"/>
-          <w:trHeight w:val="975" w:hRule="atLeast"/>
-          <w:tblHeader w:val="0"/>
-        </w:trPr>
-        <w:tc>
-          <w:tcPr>
-            <w:tcBorders>
-              <w:top w:color="000000" w:space="0" w:sz="0" w:val="nil"/>
-              <w:left w:color="aaaaaa" w:space="0" w:sz="5" w:val="single"/>
-              <w:bottom w:color="aaaaaa" w:space="0" w:sz="5" w:val="single"/>
-              <w:right w:color="aaaaaa" w:space="0" w:sz="5" w:val="single"/>
-            </w:tcBorders>
-            <w:shd w:fill="eaf5e0" w:val="clear"/>
-            <w:tcMar>
-              <w:top w:w="80.0" w:type="dxa"/>
-              <w:left w:w="100.0" w:type="dxa"/>
-              <w:bottom w:w="80.0" w:type="dxa"/>
-              <w:right w:w="100.0" w:type="dxa"/>
-            </w:tcMar>
-            <w:vAlign w:val="top"/>
-          </w:tcPr>
-          <w:p>
-            <w:pPr>
-              <w:spacing w:line="319.2000000000001" w:lineRule="auto"/>
-              <w:jc w:val="both"/>
-              <w:rPr>
-                <w:rFonts w:ascii="Times New Roman" w:cs="Times New Roman" w:eastAsia="Times New Roman" w:hAnsi="Times New Roman"/>
-                <w:sz w:val="24"/>
-                <w:szCs w:val="24"/>
-              </w:rPr>
-            </w:pPr>
-            <w:r>
-              <w:rPr>
-                <w:rFonts w:ascii="Times New Roman" w:cs="Times New Roman" w:eastAsia="Times New Roman" w:hAnsi="Times New Roman"/>
-                <w:sz w:val="24"/>
-                <w:szCs w:val="24"/>
-                <w:rtl w:val="0"/>
-              </w:rPr>
-              <w:t xml:space="preserve">RQF-14</w:t>
-            </w:r>
-          </w:p>
-        </w:tc>
-        <w:tc>
-          <w:tcPr>
-            <w:tcBorders>
-              <w:top w:color="000000" w:space="0" w:sz="0" w:val="nil"/>
-              <w:left w:color="000000" w:space="0" w:sz="0" w:val="nil"/>
-              <w:bottom w:color="aaaaaa" w:space="0" w:sz="5" w:val="single"/>
-              <w:right w:color="aaaaaa" w:space="0" w:sz="5" w:val="single"/>
-            </w:tcBorders>
-            <w:shd w:fill="eaf5e0" w:val="clear"/>
-            <w:tcMar>
-              <w:top w:w="80.0" w:type="dxa"/>
-              <w:left w:w="100.0" w:type="dxa"/>
-              <w:bottom w:w="80.0" w:type="dxa"/>
-              <w:right w:w="100.0" w:type="dxa"/>
-            </w:tcMar>
-            <w:vAlign w:val="top"/>
-          </w:tcPr>
-          <w:p>
-            <w:pPr>
-              <w:spacing w:line="319.2000000000001" w:lineRule="auto"/>
-              <w:jc w:val="both"/>
-              <w:rPr>
-                <w:rFonts w:ascii="Times New Roman" w:cs="Times New Roman" w:eastAsia="Times New Roman" w:hAnsi="Times New Roman"/>
-                <w:sz w:val="24"/>
-                <w:szCs w:val="24"/>
-              </w:rPr>
-            </w:pPr>
-            <w:r>
-              <w:rPr>
-                <w:rFonts w:ascii="Times New Roman" w:cs="Times New Roman" w:eastAsia="Times New Roman" w:hAnsi="Times New Roman"/>
-                <w:sz w:val="24"/>
-                <w:szCs w:val="24"/>
-                <w:rtl w:val="0"/>
-              </w:rPr>
-              <w:t xml:space="preserve">Gestión de Miembros</w:t>
-            </w:r>
-          </w:p>
-        </w:tc>
-        <w:tc>
-          <w:tcPr>
-            <w:tcBorders>
-              <w:top w:color="000000" w:space="0" w:sz="0" w:val="nil"/>
-              <w:left w:color="000000" w:space="0" w:sz="0" w:val="nil"/>
-              <w:bottom w:color="aaaaaa" w:space="0" w:sz="5" w:val="single"/>
-              <w:right w:color="aaaaaa" w:space="0" w:sz="5" w:val="single"/>
-            </w:tcBorders>
-            <w:shd w:fill="eaf5e0" w:val="clear"/>
-            <w:tcMar>
-              <w:top w:w="80.0" w:type="dxa"/>
-              <w:left w:w="100.0" w:type="dxa"/>
-              <w:bottom w:w="80.0" w:type="dxa"/>
-              <w:right w:w="100.0" w:type="dxa"/>
-            </w:tcMar>
-            <w:vAlign w:val="top"/>
-          </w:tcPr>
-          <w:p>
-            <w:pPr>
-              <w:spacing w:line="319.2000000000001" w:lineRule="auto"/>
-              <w:jc w:val="both"/>
-              <w:rPr>
-                <w:rFonts w:ascii="Times New Roman" w:cs="Times New Roman" w:eastAsia="Times New Roman" w:hAnsi="Times New Roman"/>
-                <w:sz w:val="24"/>
-                <w:szCs w:val="24"/>
-              </w:rPr>
-            </w:pPr>
-            <w:r>
-              <w:rPr>
-                <w:rFonts w:ascii="Times New Roman" w:cs="Times New Roman" w:eastAsia="Times New Roman" w:hAnsi="Times New Roman"/>
-                <w:sz w:val="24"/>
-                <w:szCs w:val="24"/>
-                <w:rtl w:val="0"/>
-              </w:rPr>
-              <w:t xml:space="preserve">El sistema debe enviar automáticamente cada día por WhatsApp un aviso a los miembros cuya membresía vence dentro de los días de anticipación definidos por el gimnasio (3 por defecto) o el mismo día, sin repetir avisos, y permitir al administrador ejecutar el envío de forma manual.</w:t>
-            </w:r>
-          </w:p>
-        </w:tc>
-      </w:tr>
-      <w:tr>
-        <w:trPr>
-          <w:cantSplit w:val="0"/>
-          <w:trHeight w:val="975" w:hRule="atLeast"/>
-          <w:tblHeader w:val="0"/>
-        </w:trPr>
-        <w:tc>
-          <w:tcPr>
-            <w:tcBorders>
-              <w:top w:color="000000" w:space="0" w:sz="0" w:val="nil"/>
-              <w:left w:color="aaaaaa" w:space="0" w:sz="5" w:val="single"/>
-              <w:bottom w:color="aaaaaa" w:space="0" w:sz="5" w:val="single"/>
-              <w:right w:color="aaaaaa" w:space="0" w:sz="5" w:val="single"/>
-            </w:tcBorders>
-            <w:tcMar>
-              <w:top w:w="80.0" w:type="dxa"/>
-              <w:left w:w="100.0" w:type="dxa"/>
-              <w:bottom w:w="80.0" w:type="dxa"/>
-              <w:right w:w="100.0" w:type="dxa"/>
-            </w:tcMar>
-            <w:vAlign w:val="top"/>
-          </w:tcPr>
-          <w:p>
-            <w:pPr>
-              <w:spacing w:line="319.2000000000001" w:lineRule="auto"/>
-              <w:jc w:val="both"/>
-              <w:rPr>
-                <w:rFonts w:ascii="Times New Roman" w:cs="Times New Roman" w:eastAsia="Times New Roman" w:hAnsi="Times New Roman"/>
-                <w:sz w:val="24"/>
-                <w:szCs w:val="24"/>
-              </w:rPr>
-            </w:pPr>
-            <w:r>
-              <w:rPr>
-                <w:rFonts w:ascii="Times New Roman" w:cs="Times New Roman" w:eastAsia="Times New Roman" w:hAnsi="Times New Roman"/>
-                <w:sz w:val="24"/>
-                <w:szCs w:val="24"/>
-                <w:rtl w:val="0"/>
-              </w:rPr>
-              <w:t xml:space="preserve">RQF-15</w:t>
-            </w:r>
-          </w:p>
-        </w:tc>
-        <w:tc>
-          <w:tcPr>
-            <w:tcBorders>
-              <w:top w:color="000000" w:space="0" w:sz="0" w:val="nil"/>
-              <w:left w:color="000000" w:space="0" w:sz="0" w:val="nil"/>
-              <w:bottom w:color="aaaaaa" w:space="0" w:sz="5" w:val="single"/>
-              <w:right w:color="aaaaaa" w:space="0" w:sz="5" w:val="single"/>
-            </w:tcBorders>
-            <w:tcMar>
-              <w:top w:w="80.0" w:type="dxa"/>
-              <w:left w:w="100.0" w:type="dxa"/>
-              <w:bottom w:w="80.0" w:type="dxa"/>
-              <w:right w:w="100.0" w:type="dxa"/>
-            </w:tcMar>
-            <w:vAlign w:val="top"/>
-          </w:tcPr>
-          <w:p>
-            <w:pPr>
-              <w:spacing w:line="319.2000000000001" w:lineRule="auto"/>
-              <w:jc w:val="both"/>
-              <w:rPr>
-                <w:rFonts w:ascii="Times New Roman" w:cs="Times New Roman" w:eastAsia="Times New Roman" w:hAnsi="Times New Roman"/>
-                <w:sz w:val="24"/>
-                <w:szCs w:val="24"/>
-              </w:rPr>
-            </w:pPr>
-            <w:r>
-              <w:rPr>
-                <w:rFonts w:ascii="Times New Roman" w:cs="Times New Roman" w:eastAsia="Times New Roman" w:hAnsi="Times New Roman"/>
-                <w:sz w:val="24"/>
-                <w:szCs w:val="24"/>
-                <w:rtl w:val="0"/>
-              </w:rPr>
-              <w:t xml:space="preserve">Suscripción SaaS</w:t>
-            </w:r>
-          </w:p>
-        </w:tc>
-        <w:tc>
-          <w:tcPr>
-            <w:tcBorders>
-              <w:top w:color="000000" w:space="0" w:sz="0" w:val="nil"/>
-              <w:left w:color="000000" w:space="0" w:sz="0" w:val="nil"/>
-              <w:bottom w:color="aaaaaa" w:space="0" w:sz="5" w:val="single"/>
-              <w:right w:color="aaaaaa" w:space="0" w:sz="5" w:val="single"/>
-            </w:tcBorders>
-            <w:tcMar>
-              <w:top w:w="80.0" w:type="dxa"/>
-              <w:left w:w="100.0" w:type="dxa"/>
-              <w:bottom w:w="80.0" w:type="dxa"/>
-              <w:right w:w="100.0" w:type="dxa"/>
-            </w:tcMar>
-            <w:vAlign w:val="top"/>
-          </w:tcPr>
-          <w:p>
-            <w:pPr>
-              <w:spacing w:line="319.2000000000001" w:lineRule="auto"/>
-              <w:jc w:val="both"/>
-              <w:rPr>
-                <w:rFonts w:ascii="Times New Roman" w:cs="Times New Roman" w:eastAsia="Times New Roman" w:hAnsi="Times New Roman"/>
-                <w:sz w:val="24"/>
-                <w:szCs w:val="24"/>
-              </w:rPr>
-            </w:pPr>
-            <w:r>
-              <w:rPr>
-                <w:rFonts w:ascii="Times New Roman" w:cs="Times New Roman" w:eastAsia="Times New Roman" w:hAnsi="Times New Roman"/>
-                <w:sz w:val="24"/>
-                <w:szCs w:val="24"/>
-                <w:rtl w:val="0"/>
-              </w:rPr>
-              <w:t xml:space="preserve">El sistema debe permitir al dueño de un gimnasio registrarlo en la plataforma creando su cuenta de administrador, con un período de prueba gratuita de 14 días; al vencer la prueba, debe bloquear las operaciones del gimnasio e informar que la prueba terminó.</w:t>
-            </w:r>
-          </w:p>
-        </w:tc>
-      </w:tr>
-      <w:tr>
-        <w:trPr>
-          <w:cantSplit w:val="0"/>
-          <w:trHeight w:val="975" w:hRule="atLeast"/>
-          <w:tblHeader w:val="0"/>
-        </w:trPr>
-        <w:tc>
-          <w:tcPr>
-            <w:tcBorders>
-              <w:top w:color="000000" w:space="0" w:sz="0" w:val="nil"/>
-              <w:left w:color="aaaaaa" w:space="0" w:sz="5" w:val="single"/>
-              <w:bottom w:color="aaaaaa" w:space="0" w:sz="5" w:val="single"/>
-              <w:right w:color="aaaaaa" w:space="0" w:sz="5" w:val="single"/>
-            </w:tcBorders>
-            <w:shd w:fill="eaf5e0" w:val="clear"/>
-            <w:tcMar>
-              <w:top w:w="80.0" w:type="dxa"/>
-              <w:left w:w="100.0" w:type="dxa"/>
-              <w:bottom w:w="80.0" w:type="dxa"/>
-              <w:right w:w="100.0" w:type="dxa"/>
-            </w:tcMar>
-            <w:vAlign w:val="top"/>
-          </w:tcPr>
-          <w:p>
-            <w:pPr>
-              <w:spacing w:line="319.2000000000001" w:lineRule="auto"/>
-              <w:jc w:val="both"/>
-              <w:rPr>
-                <w:rFonts w:ascii="Times New Roman" w:cs="Times New Roman" w:eastAsia="Times New Roman" w:hAnsi="Times New Roman"/>
-                <w:sz w:val="24"/>
-                <w:szCs w:val="24"/>
-              </w:rPr>
-            </w:pPr>
-            <w:r>
-              <w:rPr>
-                <w:rFonts w:ascii="Times New Roman" w:cs="Times New Roman" w:eastAsia="Times New Roman" w:hAnsi="Times New Roman"/>
-                <w:sz w:val="24"/>
-                <w:szCs w:val="24"/>
-                <w:rtl w:val="0"/>
-              </w:rPr>
-              <w:t xml:space="preserve">RQF-16</w:t>
-            </w:r>
-          </w:p>
-        </w:tc>
-        <w:tc>
-          <w:tcPr>
-            <w:tcBorders>
-              <w:top w:color="000000" w:space="0" w:sz="0" w:val="nil"/>
-              <w:left w:color="000000" w:space="0" w:sz="0" w:val="nil"/>
-              <w:bottom w:color="aaaaaa" w:space="0" w:sz="5" w:val="single"/>
-              <w:right w:color="aaaaaa" w:space="0" w:sz="5" w:val="single"/>
-            </w:tcBorders>
-            <w:shd w:fill="eaf5e0" w:val="clear"/>
-            <w:tcMar>
-              <w:top w:w="80.0" w:type="dxa"/>
-              <w:left w:w="100.0" w:type="dxa"/>
-              <w:bottom w:w="80.0" w:type="dxa"/>
-              <w:right w:w="100.0" w:type="dxa"/>
-            </w:tcMar>
-            <w:vAlign w:val="top"/>
-          </w:tcPr>
-          <w:p>
-            <w:pPr>
-              <w:spacing w:line="319.2000000000001" w:lineRule="auto"/>
-              <w:jc w:val="both"/>
-              <w:rPr>
-                <w:rFonts w:ascii="Times New Roman" w:cs="Times New Roman" w:eastAsia="Times New Roman" w:hAnsi="Times New Roman"/>
-                <w:sz w:val="24"/>
-                <w:szCs w:val="24"/>
-              </w:rPr>
-            </w:pPr>
-            <w:r>
-              <w:rPr>
-                <w:rFonts w:ascii="Times New Roman" w:cs="Times New Roman" w:eastAsia="Times New Roman" w:hAnsi="Times New Roman"/>
-                <w:sz w:val="24"/>
-                <w:szCs w:val="24"/>
-                <w:rtl w:val="0"/>
-              </w:rPr>
-              <w:t xml:space="preserve">App Móvil del Miembro</w:t>
-            </w:r>
-          </w:p>
-        </w:tc>
-        <w:tc>
-          <w:tcPr>
-            <w:tcBorders>
-              <w:top w:color="000000" w:space="0" w:sz="0" w:val="nil"/>
-              <w:left w:color="000000" w:space="0" w:sz="0" w:val="nil"/>
-              <w:bottom w:color="aaaaaa" w:space="0" w:sz="5" w:val="single"/>
-              <w:right w:color="aaaaaa" w:space="0" w:sz="5" w:val="single"/>
-            </w:tcBorders>
-            <w:shd w:fill="eaf5e0" w:val="clear"/>
-            <w:tcMar>
-              <w:top w:w="80.0" w:type="dxa"/>
-              <w:left w:w="100.0" w:type="dxa"/>
-              <w:bottom w:w="80.0" w:type="dxa"/>
-              <w:right w:w="100.0" w:type="dxa"/>
-            </w:tcMar>
-            <w:vAlign w:val="top"/>
-          </w:tcPr>
-          <w:p>
-            <w:pPr>
-              <w:spacing w:line="319.2000000000001" w:lineRule="auto"/>
-              <w:jc w:val="both"/>
-              <w:rPr>
-                <w:rFonts w:ascii="Times New Roman" w:cs="Times New Roman" w:eastAsia="Times New Roman" w:hAnsi="Times New Roman"/>
-                <w:sz w:val="24"/>
-                <w:szCs w:val="24"/>
-              </w:rPr>
-            </w:pPr>
-            <w:r>
-              <w:rPr>
-                <w:rFonts w:ascii="Times New Roman" w:cs="Times New Roman" w:eastAsia="Times New Roman" w:hAnsi="Times New Roman"/>
-                <w:sz w:val="24"/>
-                <w:szCs w:val="24"/>
-                <w:rtl w:val="0"/>
-              </w:rPr>
-              <w:t xml:space="preserve">El sistema debe ofrecer al miembro una aplicación móvil en la que inicie sesión con su número de teléfono y la contraseña asignada por el gimnasio, y consulte su código QR de acceso, su plan vigente y su historial de asistencia.</w:t>
-            </w:r>
-          </w:p>
-        </w:tc>
-      </w:tr>
     </w:tbl>
     <w:p>
       <w:pPr>
@@ -6299,124 +5821,6 @@
                 <w:rtl w:val="0"/>
               </w:rPr>
               <w:t xml:space="preserve">El sistema debe poder desplegarse en servicios de nube (AWS, Railway, Render o equivalentes) mediante contenedores Docker, sin dependencia de infraestructura física local.</w:t>
-            </w:r>
-          </w:p>
-        </w:tc>
-      </w:tr>
-      <w:tr>
-        <w:trPr>
-          <w:cantSplit w:val="0"/>
-          <w:trHeight w:val="975" w:hRule="atLeast"/>
-          <w:tblHeader w:val="0"/>
-        </w:trPr>
-        <w:tc>
-          <w:tcPr>
-            <w:tcBorders>
-              <w:top w:color="000000" w:space="0" w:sz="0" w:val="nil"/>
-              <w:left w:color="aaaaaa" w:space="0" w:sz="5" w:val="single"/>
-              <w:bottom w:color="aaaaaa" w:space="0" w:sz="5" w:val="single"/>
-              <w:right w:color="aaaaaa" w:space="0" w:sz="5" w:val="single"/>
-            </w:tcBorders>
-            <w:tcMar>
-              <w:top w:w="80.0" w:type="dxa"/>
-              <w:left w:w="100.0" w:type="dxa"/>
-              <w:bottom w:w="80.0" w:type="dxa"/>
-              <w:right w:w="100.0" w:type="dxa"/>
-            </w:tcMar>
-            <w:vAlign w:val="top"/>
-          </w:tcPr>
-          <w:p>
-            <w:pPr>
-              <w:spacing w:line="319.2000000000001" w:lineRule="auto"/>
-              <w:jc w:val="both"/>
-              <w:rPr>
-                <w:rFonts w:ascii="Times New Roman" w:cs="Times New Roman" w:eastAsia="Times New Roman" w:hAnsi="Times New Roman"/>
-                <w:sz w:val="24"/>
-                <w:szCs w:val="24"/>
-              </w:rPr>
-            </w:pPr>
-            <w:r>
-              <w:rPr>
-                <w:rFonts w:ascii="Times New Roman" w:cs="Times New Roman" w:eastAsia="Times New Roman" w:hAnsi="Times New Roman"/>
-                <w:sz w:val="24"/>
-                <w:szCs w:val="24"/>
-                <w:rtl w:val="0"/>
-              </w:rPr>
-              <w:t xml:space="preserve">RQNF-09</w:t>
-            </w:r>
-          </w:p>
-        </w:tc>
-        <w:tc>
-          <w:tcPr>
-            <w:tcBorders>
-              <w:top w:color="000000" w:space="0" w:sz="0" w:val="nil"/>
-              <w:left w:color="000000" w:space="0" w:sz="0" w:val="nil"/>
-              <w:bottom w:color="aaaaaa" w:space="0" w:sz="5" w:val="single"/>
-              <w:right w:color="aaaaaa" w:space="0" w:sz="5" w:val="single"/>
-            </w:tcBorders>
-            <w:tcMar>
-              <w:top w:w="80.0" w:type="dxa"/>
-              <w:left w:w="100.0" w:type="dxa"/>
-              <w:bottom w:w="80.0" w:type="dxa"/>
-              <w:right w:w="100.0" w:type="dxa"/>
-            </w:tcMar>
-            <w:vAlign w:val="top"/>
-          </w:tcPr>
-          <w:p>
-            <w:pPr>
-              <w:spacing w:line="319.2000000000001" w:lineRule="auto"/>
-              <w:jc w:val="both"/>
-              <w:rPr>
-                <w:rFonts w:ascii="Times New Roman" w:cs="Times New Roman" w:eastAsia="Times New Roman" w:hAnsi="Times New Roman"/>
-                <w:sz w:val="24"/>
-                <w:szCs w:val="24"/>
-              </w:rPr>
-            </w:pPr>
-            <w:r>
-              <w:rPr>
-                <w:rFonts w:ascii="Times New Roman" w:cs="Times New Roman" w:eastAsia="Times New Roman" w:hAnsi="Times New Roman"/>
-                <w:sz w:val="24"/>
-                <w:szCs w:val="24"/>
-                <w:rtl w:val="0"/>
-              </w:rPr>
-              <w:t xml:space="preserve">Mantenibilidad</w:t>
-            </w:r>
-          </w:p>
-        </w:tc>
-        <w:tc>
-          <w:tcPr>
-            <w:tcBorders>
-              <w:top w:color="000000" w:space="0" w:sz="0" w:val="nil"/>
-              <w:left w:color="000000" w:space="0" w:sz="0" w:val="nil"/>
-              <w:bottom w:color="aaaaaa" w:space="0" w:sz="5" w:val="single"/>
-              <w:right w:color="aaaaaa" w:space="0" w:sz="5" w:val="single"/>
-            </w:tcBorders>
-            <w:tcMar>
-              <w:top w:w="80.0" w:type="dxa"/>
-              <w:left w:w="100.0" w:type="dxa"/>
-              <w:bottom w:w="80.0" w:type="dxa"/>
-              <w:right w:w="100.0" w:type="dxa"/>
-            </w:tcMar>
-            <w:vAlign w:val="top"/>
-          </w:tcPr>
-          <w:p>
-            <w:pPr>
-              <w:spacing w:line="319.2000000000001" w:lineRule="auto"/>
-              <w:jc w:val="both"/>
-              <w:rPr>
-                <w:rFonts w:ascii="Times New Roman" w:cs="Times New Roman" w:eastAsia="Times New Roman" w:hAnsi="Times New Roman"/>
-                <w:sz w:val="24"/>
-                <w:szCs w:val="24"/>
-              </w:rPr>
-            </w:pPr>
-            <w:r>
-              <w:rPr>
-                <w:rFonts w:ascii="Times New Roman" w:cs="Times New Roman" w:eastAsia="Times New Roman" w:hAnsi="Times New Roman"/>
-                <w:sz w:val="24"/>
-                <w:szCs w:val="24"/>
-                <w:rtl w:val="0"/>
-              </w:rPr>
-              <w:t xml:space="preserve">El código fuente debe validarse automáticamente en integración continua (GitHub Actions) en cada pull request y en cada cambio de la rama principal, con instalación limpia de dependencias, comprobación de sintaxis del backend y compilación del frontend en Node 24.</w:t>
             </w:r>
           </w:p>
         </w:tc>

</xml_diff>